<commit_message>
fix: cập nhật giao diện SalarySlipAdmin và README
</commit_message>
<xml_diff>
--- a/frontend/src/template/luong.docx
+++ b/frontend/src/template/luong.docx
@@ -10,12 +10,12 @@
       </w:tblPr>
       <w:tblGrid>
         <w:gridCol w:w="2483"/>
-        <w:gridCol w:w="800"/>
+        <w:gridCol w:w="500"/>
         <w:gridCol w:w="1696"/>
         <w:gridCol w:w="3110"/>
-        <w:gridCol w:w="1256"/>
+        <w:gridCol w:w="800"/>
         <w:gridCol w:w="1720"/>
-        <w:gridCol w:w="754"/>
+        <w:gridCol w:w="1500"/>
       </w:tblGrid>
       <w:tr>
         <w:trPr>
@@ -23,7 +23,7 @@
         </w:trPr>
         <w:tc>
           <w:tcPr>
-            <w:tcW w:w="11065" w:type="dxa"/>
+            <w:tcW w:w="10309" w:type="dxa"/>
             <w:gridSpan w:val="6"/>
             <w:tcBorders>
               <w:top w:val="single" w:sz="4" w:space="0" w:color="auto"/>
@@ -34,6 +34,10 @@
             <w:shd w:val="clear" w:color="auto" w:fill="auto"/>
             <w:vAlign w:val="center"/>
             <w:hideMark/>
+            <w:tcMar>
+              <w:bottom w:w="40" w:type="dxa"/>
+              <w:top w:w="20" w:type="dxa"/>
+            </w:tcMar>
           </w:tcPr>
           <w:p>
             <w:pPr>
@@ -260,7 +264,7 @@
         </w:tc>
         <w:tc>
           <w:tcPr>
-            <w:tcW w:w="754" w:type="dxa"/>
+            <w:tcW w:w="1500" w:type="dxa"/>
             <w:tcBorders>
               <w:top w:val="single" w:sz="4" w:space="0" w:color="auto"/>
               <w:left w:val="nil"/>
@@ -271,6 +275,10 @@
             <w:noWrap/>
             <w:vAlign w:val="center"/>
             <w:hideMark/>
+            <w:tcMar>
+              <w:bottom w:w="40" w:type="dxa"/>
+              <w:top w:w="20" w:type="dxa"/>
+            </w:tcMar>
           </w:tcPr>
           <w:p>
             <w:pPr>
@@ -306,7 +314,7 @@
         </w:trPr>
         <w:tc>
           <w:tcPr>
-            <w:tcW w:w="11065" w:type="dxa"/>
+            <w:tcW w:w="10309" w:type="dxa"/>
             <w:gridSpan w:val="6"/>
             <w:tcBorders>
               <w:top w:val="nil"/>
@@ -317,6 +325,10 @@
             <w:noWrap/>
             <w:vAlign w:val="center"/>
             <w:hideMark/>
+            <w:tcMar>
+              <w:bottom w:w="40" w:type="dxa"/>
+              <w:top w:w="20" w:type="dxa"/>
+            </w:tcMar>
           </w:tcPr>
           <w:p>
             <w:pPr>
@@ -450,7 +462,7 @@
         </w:tc>
         <w:tc>
           <w:tcPr>
-            <w:tcW w:w="754" w:type="dxa"/>
+            <w:tcW w:w="1500" w:type="dxa"/>
             <w:tcBorders>
               <w:top w:val="nil"/>
               <w:left w:val="nil"/>
@@ -460,6 +472,10 @@
             <w:noWrap/>
             <w:vAlign w:val="bottom"/>
             <w:hideMark/>
+            <w:tcMar>
+              <w:bottom w:w="40" w:type="dxa"/>
+              <w:top w:w="20" w:type="dxa"/>
+            </w:tcMar>
           </w:tcPr>
           <w:p>
             <w:pPr>
@@ -495,7 +511,7 @@
         </w:trPr>
         <w:tc>
           <w:tcPr>
-            <w:tcW w:w="11819" w:type="dxa"/>
+            <w:tcW w:w="11809" w:type="dxa"/>
             <w:gridSpan w:val="7"/>
             <w:tcBorders>
               <w:top w:val="nil"/>
@@ -506,6 +522,10 @@
             <w:noWrap/>
             <w:vAlign w:val="center"/>
             <w:hideMark/>
+            <w:tcMar>
+              <w:bottom w:w="40" w:type="dxa"/>
+              <w:top w:w="20" w:type="dxa"/>
+            </w:tcMar>
           </w:tcPr>
           <w:p>
             <w:pPr>
@@ -617,7 +637,7 @@
         </w:trPr>
         <w:tc>
           <w:tcPr>
-            <w:tcW w:w="4979" w:type="dxa"/>
+            <w:tcW w:w="4679" w:type="dxa"/>
             <w:gridSpan w:val="3"/>
             <w:tcBorders>
               <w:left w:val="single" w:sz="4" w:space="0" w:color="auto"/>
@@ -626,6 +646,10 @@
             <w:noWrap/>
             <w:vAlign w:val="center"/>
             <w:hideMark/>
+            <w:tcMar>
+              <w:bottom w:w="40" w:type="dxa"/>
+              <w:top w:w="20" w:type="dxa"/>
+            </w:tcMar>
           </w:tcPr>
           <w:p>
             <w:pPr>
@@ -704,7 +728,7 @@
         </w:tc>
         <w:tc>
           <w:tcPr>
-            <w:tcW w:w="6840" w:type="dxa"/>
+            <w:tcW w:w="7130" w:type="dxa"/>
             <w:gridSpan w:val="4"/>
             <w:tcBorders>
               <w:right w:val="single" w:sz="4" w:space="0" w:color="auto"/>
@@ -713,6 +737,10 @@
             <w:noWrap/>
             <w:vAlign w:val="center"/>
             <w:hideMark/>
+            <w:tcMar>
+              <w:bottom w:w="40" w:type="dxa"/>
+              <w:top w:w="20" w:type="dxa"/>
+            </w:tcMar>
           </w:tcPr>
           <w:p>
             <w:pPr>
@@ -794,7 +822,7 @@
         </w:trPr>
         <w:tc>
           <w:tcPr>
-            <w:tcW w:w="4979" w:type="dxa"/>
+            <w:tcW w:w="4679" w:type="dxa"/>
             <w:gridSpan w:val="3"/>
             <w:tcBorders>
               <w:left w:val="single" w:sz="4" w:space="0" w:color="auto"/>
@@ -803,6 +831,10 @@
             <w:noWrap/>
             <w:vAlign w:val="center"/>
             <w:hideMark/>
+            <w:tcMar>
+              <w:bottom w:w="40" w:type="dxa"/>
+              <w:top w:w="20" w:type="dxa"/>
+            </w:tcMar>
           </w:tcPr>
           <w:p>
             <w:pPr>
@@ -910,7 +942,7 @@
         </w:tc>
         <w:tc>
           <w:tcPr>
-            <w:tcW w:w="6840" w:type="dxa"/>
+            <w:tcW w:w="7130" w:type="dxa"/>
             <w:gridSpan w:val="4"/>
             <w:tcBorders>
               <w:right w:val="single" w:sz="4" w:space="0" w:color="auto"/>
@@ -919,6 +951,10 @@
             <w:noWrap/>
             <w:vAlign w:val="center"/>
             <w:hideMark/>
+            <w:tcMar>
+              <w:bottom w:w="40" w:type="dxa"/>
+              <w:top w:w="20" w:type="dxa"/>
+            </w:tcMar>
           </w:tcPr>
           <w:p>
             <w:pPr>
@@ -1028,7 +1064,7 @@
         </w:trPr>
         <w:tc>
           <w:tcPr>
-            <w:tcW w:w="4979" w:type="dxa"/>
+            <w:tcW w:w="4679" w:type="dxa"/>
             <w:gridSpan w:val="3"/>
             <w:tcBorders>
               <w:left w:val="single" w:sz="4" w:space="0" w:color="auto"/>
@@ -1036,6 +1072,10 @@
             <w:shd w:val="clear" w:color="auto" w:fill="auto"/>
             <w:noWrap/>
             <w:vAlign w:val="center"/>
+            <w:tcMar>
+              <w:bottom w:w="40" w:type="dxa"/>
+              <w:top w:w="20" w:type="dxa"/>
+            </w:tcMar>
           </w:tcPr>
           <w:p>
             <w:pPr>
@@ -1099,7 +1139,7 @@
         </w:tc>
         <w:tc>
           <w:tcPr>
-            <w:tcW w:w="6840" w:type="dxa"/>
+            <w:tcW w:w="7130" w:type="dxa"/>
             <w:gridSpan w:val="4"/>
             <w:tcBorders>
               <w:right w:val="single" w:sz="4" w:space="0" w:color="auto"/>
@@ -1107,6 +1147,10 @@
             <w:shd w:val="clear" w:color="auto" w:fill="auto"/>
             <w:noWrap/>
             <w:vAlign w:val="center"/>
+            <w:tcMar>
+              <w:bottom w:w="40" w:type="dxa"/>
+              <w:top w:w="20" w:type="dxa"/>
+            </w:tcMar>
           </w:tcPr>
           <w:p>
             <w:pPr>
@@ -1133,7 +1177,7 @@
         </w:trPr>
         <w:tc>
           <w:tcPr>
-            <w:tcW w:w="4979" w:type="dxa"/>
+            <w:tcW w:w="4679" w:type="dxa"/>
             <w:gridSpan w:val="3"/>
             <w:tcBorders>
               <w:top w:val="single" w:sz="4" w:space="0" w:color="auto"/>
@@ -1145,6 +1189,10 @@
             <w:noWrap/>
             <w:vAlign w:val="center"/>
             <w:hideMark/>
+            <w:tcMar>
+              <w:bottom w:w="40" w:type="dxa"/>
+              <w:top w:w="20" w:type="dxa"/>
+            </w:tcMar>
           </w:tcPr>
           <w:p>
             <w:pPr>
@@ -1179,7 +1227,7 @@
         </w:tc>
         <w:tc>
           <w:tcPr>
-            <w:tcW w:w="4366" w:type="dxa"/>
+            <w:tcW w:w="3910" w:type="dxa"/>
             <w:gridSpan w:val="2"/>
             <w:tcBorders>
               <w:top w:val="single" w:sz="4" w:space="0" w:color="auto"/>
@@ -1191,6 +1239,10 @@
             <w:noWrap/>
             <w:vAlign w:val="center"/>
             <w:hideMark/>
+            <w:tcMar>
+              <w:bottom w:w="40" w:type="dxa"/>
+              <w:top w:w="20" w:type="dxa"/>
+            </w:tcMar>
           </w:tcPr>
           <w:p>
             <w:pPr>
@@ -1253,7 +1305,7 @@
         </w:tc>
         <w:tc>
           <w:tcPr>
-            <w:tcW w:w="2474" w:type="dxa"/>
+            <w:tcW w:w="3220" w:type="dxa"/>
             <w:gridSpan w:val="2"/>
             <w:tcBorders>
               <w:top w:val="single" w:sz="4" w:space="0" w:color="auto"/>
@@ -1265,6 +1317,10 @@
             <w:noWrap/>
             <w:vAlign w:val="center"/>
             <w:hideMark/>
+            <w:tcMar>
+              <w:bottom w:w="40" w:type="dxa"/>
+              <w:top w:w="20" w:type="dxa"/>
+            </w:tcMar>
           </w:tcPr>
           <w:p>
             <w:pPr>
@@ -1316,6 +1372,10 @@
             <w:noWrap/>
             <w:vAlign w:val="center"/>
             <w:hideMark/>
+            <w:tcMar>
+              <w:bottom w:w="40" w:type="dxa"/>
+              <w:top w:w="20" w:type="dxa"/>
+            </w:tcMar>
           </w:tcPr>
           <w:p>
             <w:pPr>
@@ -1346,7 +1406,7 @@
         </w:tc>
         <w:tc>
           <w:tcPr>
-            <w:tcW w:w="800" w:type="dxa"/>
+            <w:tcW w:w="500" w:type="dxa"/>
             <w:tcBorders>
               <w:top w:val="nil"/>
               <w:left w:val="nil"/>
@@ -1357,6 +1417,10 @@
             <w:noWrap/>
             <w:vAlign w:val="center"/>
             <w:hideMark/>
+            <w:tcMar>
+              <w:bottom w:w="40" w:type="dxa"/>
+              <w:top w:w="20" w:type="dxa"/>
+            </w:tcMar>
           </w:tcPr>
           <w:p>
             <w:pPr>
@@ -1398,6 +1462,10 @@
             <w:noWrap/>
             <w:vAlign w:val="center"/>
             <w:hideMark/>
+            <w:tcMar>
+              <w:bottom w:w="40" w:type="dxa"/>
+              <w:top w:w="20" w:type="dxa"/>
+            </w:tcMar>
           </w:tcPr>
           <w:p>
             <w:pPr>
@@ -1464,7 +1532,7 @@
         </w:tc>
         <w:tc>
           <w:tcPr>
-            <w:tcW w:w="4366" w:type="dxa"/>
+            <w:tcW w:w="3910" w:type="dxa"/>
             <w:gridSpan w:val="2"/>
             <w:tcBorders>
               <w:top w:val="nil"/>
@@ -1476,6 +1544,10 @@
             <w:noWrap/>
             <w:vAlign w:val="center"/>
             <w:hideMark/>
+            <w:tcMar>
+              <w:bottom w:w="40" w:type="dxa"/>
+              <w:top w:w="20" w:type="dxa"/>
+            </w:tcMar>
           </w:tcPr>
           <w:p>
             <w:pPr>
@@ -1517,6 +1589,10 @@
             <w:noWrap/>
             <w:vAlign w:val="center"/>
             <w:hideMark/>
+            <w:tcMar>
+              <w:bottom w:w="40" w:type="dxa"/>
+              <w:top w:w="20" w:type="dxa"/>
+            </w:tcMar>
           </w:tcPr>
           <w:p>
             <w:pPr>
@@ -1571,7 +1647,7 @@
         </w:tc>
         <w:tc>
           <w:tcPr>
-            <w:tcW w:w="754" w:type="dxa"/>
+            <w:tcW w:w="1500" w:type="dxa"/>
             <w:tcBorders>
               <w:top w:val="nil"/>
               <w:left w:val="nil"/>
@@ -1582,6 +1658,10 @@
             <w:noWrap/>
             <w:vAlign w:val="center"/>
             <w:hideMark/>
+            <w:tcMar>
+              <w:bottom w:w="40" w:type="dxa"/>
+              <w:top w:w="20" w:type="dxa"/>
+            </w:tcMar>
           </w:tcPr>
           <w:p>
             <w:pPr>
@@ -1628,6 +1708,10 @@
             <w:noWrap/>
             <w:vAlign w:val="center"/>
             <w:hideMark/>
+            <w:tcMar>
+              <w:bottom w:w="40" w:type="dxa"/>
+              <w:top w:w="20" w:type="dxa"/>
+            </w:tcMar>
           </w:tcPr>
           <w:p>
             <w:pPr>
@@ -1682,7 +1766,7 @@
         </w:tc>
         <w:tc>
           <w:tcPr>
-            <w:tcW w:w="800" w:type="dxa"/>
+            <w:tcW w:w="500" w:type="dxa"/>
             <w:tcBorders>
               <w:top w:val="nil"/>
               <w:left w:val="nil"/>
@@ -1693,6 +1777,10 @@
             <w:noWrap/>
             <w:vAlign w:val="center"/>
             <w:hideMark/>
+            <w:tcMar>
+              <w:bottom w:w="40" w:type="dxa"/>
+              <w:top w:w="20" w:type="dxa"/>
+            </w:tcMar>
           </w:tcPr>
           <w:p>
             <w:pPr>
@@ -1734,6 +1822,10 @@
             <w:noWrap/>
             <w:vAlign w:val="center"/>
             <w:hideMark/>
+            <w:tcMar>
+              <w:bottom w:w="40" w:type="dxa"/>
+              <w:top w:w="20" w:type="dxa"/>
+            </w:tcMar>
           </w:tcPr>
           <w:p>
             <w:pPr>
@@ -1800,7 +1892,7 @@
         </w:tc>
         <w:tc>
           <w:tcPr>
-            <w:tcW w:w="4366" w:type="dxa"/>
+            <w:tcW w:w="3910" w:type="dxa"/>
             <w:gridSpan w:val="2"/>
             <w:tcBorders>
               <w:top w:val="single" w:sz="4" w:space="0" w:color="auto"/>
@@ -1812,6 +1904,10 @@
             <w:noWrap/>
             <w:vAlign w:val="center"/>
             <w:hideMark/>
+            <w:tcMar>
+              <w:bottom w:w="40" w:type="dxa"/>
+              <w:top w:w="20" w:type="dxa"/>
+            </w:tcMar>
           </w:tcPr>
           <w:p>
             <w:pPr>
@@ -1853,6 +1949,10 @@
             <w:noWrap/>
             <w:vAlign w:val="center"/>
             <w:hideMark/>
+            <w:tcMar>
+              <w:bottom w:w="40" w:type="dxa"/>
+              <w:top w:w="20" w:type="dxa"/>
+            </w:tcMar>
           </w:tcPr>
           <w:p>
             <w:pPr>
@@ -1907,7 +2007,7 @@
         </w:tc>
         <w:tc>
           <w:tcPr>
-            <w:tcW w:w="754" w:type="dxa"/>
+            <w:tcW w:w="1500" w:type="dxa"/>
             <w:tcBorders>
               <w:top w:val="nil"/>
               <w:left w:val="nil"/>
@@ -1918,6 +2018,10 @@
             <w:noWrap/>
             <w:vAlign w:val="center"/>
             <w:hideMark/>
+            <w:tcMar>
+              <w:bottom w:w="40" w:type="dxa"/>
+              <w:top w:w="20" w:type="dxa"/>
+            </w:tcMar>
           </w:tcPr>
           <w:p>
             <w:pPr>
@@ -1953,7 +2057,7 @@
         </w:trPr>
         <w:tc>
           <w:tcPr>
-            <w:tcW w:w="3283" w:type="dxa"/>
+            <w:tcW w:w="2983" w:type="dxa"/>
             <w:gridSpan w:val="2"/>
             <w:tcBorders>
               <w:top w:val="single" w:sz="4" w:space="0" w:color="auto"/>
@@ -1965,6 +2069,10 @@
             <w:noWrap/>
             <w:vAlign w:val="center"/>
             <w:hideMark/>
+            <w:tcMar>
+              <w:bottom w:w="40" w:type="dxa"/>
+              <w:top w:w="20" w:type="dxa"/>
+            </w:tcMar>
           </w:tcPr>
           <w:p>
             <w:pPr>
@@ -2006,6 +2114,10 @@
             <w:noWrap/>
             <w:vAlign w:val="center"/>
             <w:hideMark/>
+            <w:tcMar>
+              <w:bottom w:w="40" w:type="dxa"/>
+              <w:top w:w="20" w:type="dxa"/>
+            </w:tcMar>
           </w:tcPr>
           <w:p>
             <w:pPr>
@@ -2072,7 +2184,7 @@
         </w:tc>
         <w:tc>
           <w:tcPr>
-            <w:tcW w:w="4366" w:type="dxa"/>
+            <w:tcW w:w="3910" w:type="dxa"/>
             <w:gridSpan w:val="2"/>
             <w:tcBorders>
               <w:top w:val="single" w:sz="4" w:space="0" w:color="auto"/>
@@ -2084,6 +2196,10 @@
             <w:noWrap/>
             <w:vAlign w:val="center"/>
             <w:hideMark/>
+            <w:tcMar>
+              <w:bottom w:w="40" w:type="dxa"/>
+              <w:top w:w="20" w:type="dxa"/>
+            </w:tcMar>
           </w:tcPr>
           <w:p>
             <w:pPr>
@@ -2125,6 +2241,10 @@
             <w:noWrap/>
             <w:vAlign w:val="center"/>
             <w:hideMark/>
+            <w:tcMar>
+              <w:bottom w:w="40" w:type="dxa"/>
+              <w:top w:w="20" w:type="dxa"/>
+            </w:tcMar>
           </w:tcPr>
           <w:p>
             <w:pPr>
@@ -2179,7 +2299,7 @@
         </w:tc>
         <w:tc>
           <w:tcPr>
-            <w:tcW w:w="754" w:type="dxa"/>
+            <w:tcW w:w="1500" w:type="dxa"/>
             <w:tcBorders>
               <w:top w:val="nil"/>
               <w:left w:val="nil"/>
@@ -2190,6 +2310,10 @@
             <w:noWrap/>
             <w:vAlign w:val="center"/>
             <w:hideMark/>
+            <w:tcMar>
+              <w:bottom w:w="40" w:type="dxa"/>
+              <w:top w:w="20" w:type="dxa"/>
+            </w:tcMar>
           </w:tcPr>
           <w:p>
             <w:pPr>
@@ -2236,6 +2360,10 @@
             <w:noWrap/>
             <w:vAlign w:val="center"/>
             <w:hideMark/>
+            <w:tcMar>
+              <w:bottom w:w="40" w:type="dxa"/>
+              <w:top w:w="20" w:type="dxa"/>
+            </w:tcMar>
           </w:tcPr>
           <w:p>
             <w:pPr>
@@ -2266,7 +2394,7 @@
         </w:tc>
         <w:tc>
           <w:tcPr>
-            <w:tcW w:w="800" w:type="dxa"/>
+            <w:tcW w:w="500" w:type="dxa"/>
             <w:tcBorders>
               <w:top w:val="nil"/>
               <w:left w:val="nil"/>
@@ -2277,6 +2405,10 @@
             <w:noWrap/>
             <w:vAlign w:val="center"/>
             <w:hideMark/>
+            <w:tcMar>
+              <w:bottom w:w="40" w:type="dxa"/>
+              <w:top w:w="20" w:type="dxa"/>
+            </w:tcMar>
           </w:tcPr>
           <w:p>
             <w:pPr>
@@ -2319,6 +2451,10 @@
             <w:noWrap/>
             <w:vAlign w:val="center"/>
             <w:hideMark/>
+            <w:tcMar>
+              <w:bottom w:w="40" w:type="dxa"/>
+              <w:top w:w="20" w:type="dxa"/>
+            </w:tcMar>
           </w:tcPr>
           <w:p>
             <w:pPr>
@@ -2373,7 +2509,7 @@
         </w:tc>
         <w:tc>
           <w:tcPr>
-            <w:tcW w:w="4366" w:type="dxa"/>
+            <w:tcW w:w="3910" w:type="dxa"/>
             <w:gridSpan w:val="2"/>
             <w:tcBorders>
               <w:top w:val="single" w:sz="4" w:space="0" w:color="auto"/>
@@ -2385,6 +2521,10 @@
             <w:noWrap/>
             <w:vAlign w:val="center"/>
             <w:hideMark/>
+            <w:tcMar>
+              <w:bottom w:w="40" w:type="dxa"/>
+              <w:top w:w="20" w:type="dxa"/>
+            </w:tcMar>
           </w:tcPr>
           <w:p>
             <w:pPr>
@@ -2426,6 +2566,10 @@
             <w:noWrap/>
             <w:vAlign w:val="center"/>
             <w:hideMark/>
+            <w:tcMar>
+              <w:bottom w:w="40" w:type="dxa"/>
+              <w:top w:w="20" w:type="dxa"/>
+            </w:tcMar>
           </w:tcPr>
           <w:p>
             <w:pPr>
@@ -2480,7 +2624,7 @@
         </w:tc>
         <w:tc>
           <w:tcPr>
-            <w:tcW w:w="754" w:type="dxa"/>
+            <w:tcW w:w="1500" w:type="dxa"/>
             <w:tcBorders>
               <w:top w:val="nil"/>
               <w:left w:val="nil"/>
@@ -2491,6 +2635,10 @@
             <w:noWrap/>
             <w:vAlign w:val="center"/>
             <w:hideMark/>
+            <w:tcMar>
+              <w:bottom w:w="40" w:type="dxa"/>
+              <w:top w:w="20" w:type="dxa"/>
+            </w:tcMar>
           </w:tcPr>
           <w:p>
             <w:pPr>
@@ -2526,7 +2674,7 @@
         </w:trPr>
         <w:tc>
           <w:tcPr>
-            <w:tcW w:w="3283" w:type="dxa"/>
+            <w:tcW w:w="2983" w:type="dxa"/>
             <w:gridSpan w:val="2"/>
             <w:tcBorders>
               <w:top w:val="single" w:sz="4" w:space="0" w:color="auto"/>
@@ -2538,6 +2686,10 @@
             <w:noWrap/>
             <w:vAlign w:val="center"/>
             <w:hideMark/>
+            <w:tcMar>
+              <w:bottom w:w="40" w:type="dxa"/>
+              <w:top w:w="20" w:type="dxa"/>
+            </w:tcMar>
           </w:tcPr>
           <w:p>
             <w:pPr>
@@ -2603,6 +2755,10 @@
             <w:noWrap/>
             <w:vAlign w:val="center"/>
             <w:hideMark/>
+            <w:tcMar>
+              <w:bottom w:w="40" w:type="dxa"/>
+              <w:top w:w="20" w:type="dxa"/>
+            </w:tcMar>
           </w:tcPr>
           <w:p>
             <w:pPr>
@@ -2657,7 +2813,7 @@
         </w:tc>
         <w:tc>
           <w:tcPr>
-            <w:tcW w:w="4366" w:type="dxa"/>
+            <w:tcW w:w="3910" w:type="dxa"/>
             <w:gridSpan w:val="2"/>
             <w:tcBorders>
               <w:top w:val="single" w:sz="4" w:space="0" w:color="auto"/>
@@ -2669,6 +2825,10 @@
             <w:noWrap/>
             <w:vAlign w:val="center"/>
             <w:hideMark/>
+            <w:tcMar>
+              <w:bottom w:w="40" w:type="dxa"/>
+              <w:top w:w="20" w:type="dxa"/>
+            </w:tcMar>
           </w:tcPr>
           <w:p>
             <w:pPr>
@@ -2710,6 +2870,10 @@
             <w:noWrap/>
             <w:vAlign w:val="center"/>
             <w:hideMark/>
+            <w:tcMar>
+              <w:bottom w:w="40" w:type="dxa"/>
+              <w:top w:w="20" w:type="dxa"/>
+            </w:tcMar>
           </w:tcPr>
           <w:p>
             <w:pPr>
@@ -2764,7 +2928,7 @@
         </w:tc>
         <w:tc>
           <w:tcPr>
-            <w:tcW w:w="754" w:type="dxa"/>
+            <w:tcW w:w="1500" w:type="dxa"/>
             <w:tcBorders>
               <w:top w:val="nil"/>
               <w:left w:val="nil"/>
@@ -2775,6 +2939,10 @@
             <w:noWrap/>
             <w:vAlign w:val="center"/>
             <w:hideMark/>
+            <w:tcMar>
+              <w:bottom w:w="40" w:type="dxa"/>
+              <w:top w:w="20" w:type="dxa"/>
+            </w:tcMar>
           </w:tcPr>
           <w:p>
             <w:pPr>
@@ -2810,7 +2978,7 @@
         </w:trPr>
         <w:tc>
           <w:tcPr>
-            <w:tcW w:w="3283" w:type="dxa"/>
+            <w:tcW w:w="2983" w:type="dxa"/>
             <w:gridSpan w:val="2"/>
             <w:tcBorders>
               <w:top w:val="single" w:sz="4" w:space="0" w:color="auto"/>
@@ -2822,6 +2990,10 @@
             <w:noWrap/>
             <w:vAlign w:val="center"/>
             <w:hideMark/>
+            <w:tcMar>
+              <w:bottom w:w="40" w:type="dxa"/>
+              <w:top w:w="20" w:type="dxa"/>
+            </w:tcMar>
           </w:tcPr>
           <w:p>
             <w:pPr>
@@ -2911,6 +3083,10 @@
             <w:noWrap/>
             <w:vAlign w:val="center"/>
             <w:hideMark/>
+            <w:tcMar>
+              <w:bottom w:w="40" w:type="dxa"/>
+              <w:top w:w="20" w:type="dxa"/>
+            </w:tcMar>
           </w:tcPr>
           <w:p>
             <w:pPr>
@@ -2965,7 +3141,7 @@
         </w:tc>
         <w:tc>
           <w:tcPr>
-            <w:tcW w:w="4366" w:type="dxa"/>
+            <w:tcW w:w="3910" w:type="dxa"/>
             <w:gridSpan w:val="2"/>
             <w:tcBorders>
               <w:top w:val="single" w:sz="4" w:space="0" w:color="auto"/>
@@ -2977,6 +3153,10 @@
             <w:noWrap/>
             <w:vAlign w:val="center"/>
             <w:hideMark/>
+            <w:tcMar>
+              <w:bottom w:w="40" w:type="dxa"/>
+              <w:top w:w="20" w:type="dxa"/>
+            </w:tcMar>
           </w:tcPr>
           <w:p>
             <w:pPr>
@@ -3066,6 +3246,10 @@
             <w:noWrap/>
             <w:vAlign w:val="center"/>
             <w:hideMark/>
+            <w:tcMar>
+              <w:bottom w:w="40" w:type="dxa"/>
+              <w:top w:w="20" w:type="dxa"/>
+            </w:tcMar>
           </w:tcPr>
           <w:p>
             <w:pPr>
@@ -3096,7 +3280,7 @@
         </w:tc>
         <w:tc>
           <w:tcPr>
-            <w:tcW w:w="754" w:type="dxa"/>
+            <w:tcW w:w="1500" w:type="dxa"/>
             <w:tcBorders>
               <w:top w:val="nil"/>
               <w:left w:val="nil"/>
@@ -3107,6 +3291,10 @@
             <w:noWrap/>
             <w:vAlign w:val="center"/>
             <w:hideMark/>
+            <w:tcMar>
+              <w:bottom w:w="40" w:type="dxa"/>
+              <w:top w:w="20" w:type="dxa"/>
+            </w:tcMar>
           </w:tcPr>
           <w:p>
             <w:pPr>
@@ -3142,7 +3330,7 @@
         </w:trPr>
         <w:tc>
           <w:tcPr>
-            <w:tcW w:w="3283" w:type="dxa"/>
+            <w:tcW w:w="2983" w:type="dxa"/>
             <w:gridSpan w:val="2"/>
             <w:tcBorders>
               <w:top w:val="single" w:sz="4" w:space="0" w:color="auto"/>
@@ -3154,6 +3342,10 @@
             <w:noWrap/>
             <w:vAlign w:val="center"/>
             <w:hideMark/>
+            <w:tcMar>
+              <w:bottom w:w="40" w:type="dxa"/>
+              <w:top w:w="20" w:type="dxa"/>
+            </w:tcMar>
           </w:tcPr>
           <w:p>
             <w:pPr>
@@ -3195,6 +3387,10 @@
             <w:noWrap/>
             <w:vAlign w:val="center"/>
             <w:hideMark/>
+            <w:tcMar>
+              <w:bottom w:w="40" w:type="dxa"/>
+              <w:top w:w="20" w:type="dxa"/>
+            </w:tcMar>
           </w:tcPr>
           <w:p>
             <w:pPr>
@@ -3225,7 +3421,7 @@
         </w:tc>
         <w:tc>
           <w:tcPr>
-            <w:tcW w:w="4366" w:type="dxa"/>
+            <w:tcW w:w="3910" w:type="dxa"/>
             <w:gridSpan w:val="2"/>
             <w:tcBorders>
               <w:top w:val="single" w:sz="4" w:space="0" w:color="auto"/>
@@ -3237,6 +3433,10 @@
             <w:noWrap/>
             <w:vAlign w:val="center"/>
             <w:hideMark/>
+            <w:tcMar>
+              <w:bottom w:w="40" w:type="dxa"/>
+              <w:top w:w="20" w:type="dxa"/>
+            </w:tcMar>
           </w:tcPr>
           <w:p>
             <w:pPr>
@@ -3278,6 +3478,10 @@
             <w:noWrap/>
             <w:vAlign w:val="center"/>
             <w:hideMark/>
+            <w:tcMar>
+              <w:bottom w:w="40" w:type="dxa"/>
+              <w:top w:w="20" w:type="dxa"/>
+            </w:tcMar>
           </w:tcPr>
           <w:p>
             <w:pPr>
@@ -3332,7 +3536,7 @@
         </w:tc>
         <w:tc>
           <w:tcPr>
-            <w:tcW w:w="754" w:type="dxa"/>
+            <w:tcW w:w="1500" w:type="dxa"/>
             <w:tcBorders>
               <w:top w:val="nil"/>
               <w:left w:val="nil"/>
@@ -3343,6 +3547,10 @@
             <w:noWrap/>
             <w:vAlign w:val="center"/>
             <w:hideMark/>
+            <w:tcMar>
+              <w:bottom w:w="40" w:type="dxa"/>
+              <w:top w:w="20" w:type="dxa"/>
+            </w:tcMar>
           </w:tcPr>
           <w:p>
             <w:pPr>
@@ -3378,7 +3586,7 @@
         </w:trPr>
         <w:tc>
           <w:tcPr>
-            <w:tcW w:w="3283" w:type="dxa"/>
+            <w:tcW w:w="2983" w:type="dxa"/>
             <w:gridSpan w:val="2"/>
             <w:tcBorders>
               <w:top w:val="single" w:sz="4" w:space="0" w:color="auto"/>
@@ -3390,6 +3598,10 @@
             <w:noWrap/>
             <w:vAlign w:val="center"/>
             <w:hideMark/>
+            <w:tcMar>
+              <w:bottom w:w="40" w:type="dxa"/>
+              <w:top w:w="20" w:type="dxa"/>
+            </w:tcMar>
           </w:tcPr>
           <w:p>
             <w:pPr>
@@ -3431,6 +3643,10 @@
             <w:noWrap/>
             <w:vAlign w:val="center"/>
             <w:hideMark/>
+            <w:tcMar>
+              <w:bottom w:w="40" w:type="dxa"/>
+              <w:top w:w="20" w:type="dxa"/>
+            </w:tcMar>
           </w:tcPr>
           <w:p>
             <w:pPr>
@@ -3461,7 +3677,7 @@
         </w:tc>
         <w:tc>
           <w:tcPr>
-            <w:tcW w:w="4366" w:type="dxa"/>
+            <w:tcW w:w="3910" w:type="dxa"/>
             <w:gridSpan w:val="2"/>
             <w:tcBorders>
               <w:top w:val="single" w:sz="4" w:space="0" w:color="auto"/>
@@ -3472,6 +3688,10 @@
             <w:shd w:val="clear" w:color="auto" w:fill="auto"/>
             <w:noWrap/>
             <w:vAlign w:val="center"/>
+            <w:tcMar>
+              <w:bottom w:w="40" w:type="dxa"/>
+              <w:top w:w="20" w:type="dxa"/>
+            </w:tcMar>
           </w:tcPr>
           <w:p>
             <w:pPr>
@@ -3513,6 +3733,10 @@
             <w:noWrap/>
             <w:vAlign w:val="center"/>
             <w:hideMark/>
+            <w:tcMar>
+              <w:bottom w:w="40" w:type="dxa"/>
+              <w:top w:w="20" w:type="dxa"/>
+            </w:tcMar>
           </w:tcPr>
           <w:p>
             <w:pPr>
@@ -3567,7 +3791,7 @@
         </w:tc>
         <w:tc>
           <w:tcPr>
-            <w:tcW w:w="754" w:type="dxa"/>
+            <w:tcW w:w="1500" w:type="dxa"/>
             <w:tcBorders>
               <w:top w:val="nil"/>
               <w:left w:val="nil"/>
@@ -3578,6 +3802,10 @@
             <w:noWrap/>
             <w:vAlign w:val="center"/>
             <w:hideMark/>
+            <w:tcMar>
+              <w:bottom w:w="40" w:type="dxa"/>
+              <w:top w:w="20" w:type="dxa"/>
+            </w:tcMar>
           </w:tcPr>
           <w:p>
             <w:pPr>
@@ -3624,6 +3852,10 @@
             <w:noWrap/>
             <w:vAlign w:val="center"/>
             <w:hideMark/>
+            <w:tcMar>
+              <w:bottom w:w="40" w:type="dxa"/>
+              <w:top w:w="20" w:type="dxa"/>
+            </w:tcMar>
           </w:tcPr>
           <w:p>
             <w:pPr>
@@ -3666,7 +3898,7 @@
         </w:tc>
         <w:tc>
           <w:tcPr>
-            <w:tcW w:w="800" w:type="dxa"/>
+            <w:tcW w:w="500" w:type="dxa"/>
             <w:tcBorders>
               <w:top w:val="nil"/>
               <w:left w:val="nil"/>
@@ -3677,6 +3909,10 @@
             <w:noWrap/>
             <w:vAlign w:val="center"/>
             <w:hideMark/>
+            <w:tcMar>
+              <w:bottom w:w="40" w:type="dxa"/>
+              <w:top w:w="20" w:type="dxa"/>
+            </w:tcMar>
           </w:tcPr>
           <w:p>
             <w:pPr>
@@ -3719,6 +3955,10 @@
             <w:noWrap/>
             <w:vAlign w:val="center"/>
             <w:hideMark/>
+            <w:tcMar>
+              <w:bottom w:w="40" w:type="dxa"/>
+              <w:top w:w="20" w:type="dxa"/>
+            </w:tcMar>
           </w:tcPr>
           <w:p>
             <w:pPr>
@@ -3749,7 +3989,7 @@
         </w:tc>
         <w:tc>
           <w:tcPr>
-            <w:tcW w:w="4366" w:type="dxa"/>
+            <w:tcW w:w="3910" w:type="dxa"/>
             <w:gridSpan w:val="2"/>
             <w:tcBorders>
               <w:top w:val="single" w:sz="4" w:space="0" w:color="auto"/>
@@ -3760,6 +4000,10 @@
             <w:shd w:val="clear" w:color="auto" w:fill="auto"/>
             <w:noWrap/>
             <w:vAlign w:val="center"/>
+            <w:tcMar>
+              <w:bottom w:w="40" w:type="dxa"/>
+              <w:top w:w="20" w:type="dxa"/>
+            </w:tcMar>
           </w:tcPr>
           <w:p>
             <w:pPr>
@@ -3801,6 +4045,10 @@
             <w:noWrap/>
             <w:vAlign w:val="center"/>
             <w:hideMark/>
+            <w:tcMar>
+              <w:bottom w:w="40" w:type="dxa"/>
+              <w:top w:w="20" w:type="dxa"/>
+            </w:tcMar>
           </w:tcPr>
           <w:p>
             <w:pPr>
@@ -3855,7 +4103,7 @@
         </w:tc>
         <w:tc>
           <w:tcPr>
-            <w:tcW w:w="754" w:type="dxa"/>
+            <w:tcW w:w="1500" w:type="dxa"/>
             <w:tcBorders>
               <w:top w:val="nil"/>
               <w:left w:val="nil"/>
@@ -3866,6 +4114,10 @@
             <w:noWrap/>
             <w:vAlign w:val="center"/>
             <w:hideMark/>
+            <w:tcMar>
+              <w:bottom w:w="40" w:type="dxa"/>
+              <w:top w:w="20" w:type="dxa"/>
+            </w:tcMar>
           </w:tcPr>
           <w:p>
             <w:pPr>
@@ -3912,6 +4164,10 @@
             <w:noWrap/>
             <w:vAlign w:val="center"/>
             <w:hideMark/>
+            <w:tcMar>
+              <w:bottom w:w="40" w:type="dxa"/>
+              <w:top w:w="20" w:type="dxa"/>
+            </w:tcMar>
           </w:tcPr>
           <w:p>
             <w:pPr>
@@ -3966,7 +4222,7 @@
         </w:tc>
         <w:tc>
           <w:tcPr>
-            <w:tcW w:w="800" w:type="dxa"/>
+            <w:tcW w:w="500" w:type="dxa"/>
             <w:tcBorders>
               <w:top w:val="nil"/>
               <w:left w:val="nil"/>
@@ -3977,6 +4233,10 @@
             <w:noWrap/>
             <w:vAlign w:val="center"/>
             <w:hideMark/>
+            <w:tcMar>
+              <w:bottom w:w="40" w:type="dxa"/>
+              <w:top w:w="20" w:type="dxa"/>
+            </w:tcMar>
           </w:tcPr>
           <w:p>
             <w:pPr>
@@ -4019,6 +4279,10 @@
             <w:noWrap/>
             <w:vAlign w:val="center"/>
             <w:hideMark/>
+            <w:tcMar>
+              <w:bottom w:w="40" w:type="dxa"/>
+              <w:top w:w="20" w:type="dxa"/>
+            </w:tcMar>
           </w:tcPr>
           <w:p>
             <w:pPr>
@@ -4061,7 +4325,7 @@
         </w:tc>
         <w:tc>
           <w:tcPr>
-            <w:tcW w:w="4366" w:type="dxa"/>
+            <w:tcW w:w="3910" w:type="dxa"/>
             <w:gridSpan w:val="2"/>
             <w:tcBorders>
               <w:top w:val="single" w:sz="4" w:space="0" w:color="auto"/>
@@ -4072,6 +4336,10 @@
             <w:shd w:val="clear" w:color="auto" w:fill="auto"/>
             <w:noWrap/>
             <w:vAlign w:val="center"/>
+            <w:tcMar>
+              <w:bottom w:w="40" w:type="dxa"/>
+              <w:top w:w="20" w:type="dxa"/>
+            </w:tcMar>
           </w:tcPr>
           <w:p>
             <w:pPr>
@@ -4112,6 +4380,10 @@
             <w:shd w:val="clear" w:color="auto" w:fill="auto"/>
             <w:noWrap/>
             <w:vAlign w:val="center"/>
+            <w:tcMar>
+              <w:bottom w:w="40" w:type="dxa"/>
+              <w:top w:w="20" w:type="dxa"/>
+            </w:tcMar>
           </w:tcPr>
           <w:p>
             <w:pPr>
@@ -4142,7 +4414,7 @@
         </w:tc>
         <w:tc>
           <w:tcPr>
-            <w:tcW w:w="754" w:type="dxa"/>
+            <w:tcW w:w="1500" w:type="dxa"/>
             <w:tcBorders>
               <w:top w:val="nil"/>
               <w:left w:val="nil"/>
@@ -4153,6 +4425,10 @@
             <w:noWrap/>
             <w:vAlign w:val="center"/>
             <w:hideMark/>
+            <w:tcMar>
+              <w:bottom w:w="40" w:type="dxa"/>
+              <w:top w:w="20" w:type="dxa"/>
+            </w:tcMar>
           </w:tcPr>
           <w:p>
             <w:pPr>
@@ -4188,7 +4464,7 @@
         </w:trPr>
         <w:tc>
           <w:tcPr>
-            <w:tcW w:w="3283" w:type="dxa"/>
+            <w:tcW w:w="2983" w:type="dxa"/>
             <w:gridSpan w:val="2"/>
             <w:tcBorders>
               <w:top w:val="single" w:sz="4" w:space="0" w:color="auto"/>
@@ -4200,6 +4476,10 @@
             <w:noWrap/>
             <w:vAlign w:val="center"/>
             <w:hideMark/>
+            <w:tcMar>
+              <w:bottom w:w="40" w:type="dxa"/>
+              <w:top w:w="20" w:type="dxa"/>
+            </w:tcMar>
           </w:tcPr>
           <w:p>
             <w:pPr>
@@ -4241,6 +4521,10 @@
             <w:noWrap/>
             <w:vAlign w:val="center"/>
             <w:hideMark/>
+            <w:tcMar>
+              <w:bottom w:w="40" w:type="dxa"/>
+              <w:top w:w="20" w:type="dxa"/>
+            </w:tcMar>
           </w:tcPr>
           <w:p>
             <w:pPr>
@@ -4282,6 +4566,10 @@
             <w:noWrap/>
             <w:vAlign w:val="center"/>
             <w:hideMark/>
+            <w:tcMar>
+              <w:bottom w:w="40" w:type="dxa"/>
+              <w:top w:w="20" w:type="dxa"/>
+            </w:tcMar>
           </w:tcPr>
           <w:p>
             <w:pPr>
@@ -4312,7 +4600,7 @@
         </w:tc>
         <w:tc>
           <w:tcPr>
-            <w:tcW w:w="1256" w:type="dxa"/>
+            <w:tcW w:w="800" w:type="dxa"/>
             <w:tcBorders>
               <w:top w:val="nil"/>
               <w:left w:val="nil"/>
@@ -4322,6 +4610,10 @@
             <w:shd w:val="clear" w:color="auto" w:fill="auto"/>
             <w:noWrap/>
             <w:vAlign w:val="center"/>
+            <w:tcMar>
+              <w:bottom w:w="40" w:type="dxa"/>
+              <w:top w:w="20" w:type="dxa"/>
+            </w:tcMar>
           </w:tcPr>
           <w:p>
             <w:pPr>
@@ -4350,6 +4642,10 @@
             <w:shd w:val="clear" w:color="auto" w:fill="auto"/>
             <w:noWrap/>
             <w:vAlign w:val="center"/>
+            <w:tcMar>
+              <w:bottom w:w="40" w:type="dxa"/>
+              <w:top w:w="20" w:type="dxa"/>
+            </w:tcMar>
           </w:tcPr>
           <w:p>
             <w:pPr>
@@ -4404,7 +4700,7 @@
         </w:tc>
         <w:tc>
           <w:tcPr>
-            <w:tcW w:w="754" w:type="dxa"/>
+            <w:tcW w:w="1500" w:type="dxa"/>
             <w:tcBorders>
               <w:top w:val="nil"/>
               <w:left w:val="nil"/>
@@ -4415,6 +4711,10 @@
             <w:noWrap/>
             <w:vAlign w:val="center"/>
             <w:hideMark/>
+            <w:tcMar>
+              <w:bottom w:w="40" w:type="dxa"/>
+              <w:top w:w="20" w:type="dxa"/>
+            </w:tcMar>
           </w:tcPr>
           <w:p>
             <w:pPr>
@@ -4450,7 +4750,7 @@
         </w:trPr>
         <w:tc>
           <w:tcPr>
-            <w:tcW w:w="3283" w:type="dxa"/>
+            <w:tcW w:w="2983" w:type="dxa"/>
             <w:gridSpan w:val="2"/>
             <w:tcBorders>
               <w:top w:val="single" w:sz="4" w:space="0" w:color="auto"/>
@@ -4462,6 +4762,10 @@
             <w:noWrap/>
             <w:vAlign w:val="center"/>
             <w:hideMark/>
+            <w:tcMar>
+              <w:bottom w:w="40" w:type="dxa"/>
+              <w:top w:w="20" w:type="dxa"/>
+            </w:tcMar>
           </w:tcPr>
           <w:p>
             <w:pPr>
@@ -4527,6 +4831,10 @@
             <w:noWrap/>
             <w:vAlign w:val="center"/>
             <w:hideMark/>
+            <w:tcMar>
+              <w:bottom w:w="40" w:type="dxa"/>
+              <w:top w:w="20" w:type="dxa"/>
+            </w:tcMar>
           </w:tcPr>
           <w:p>
             <w:pPr>
@@ -4557,7 +4865,7 @@
         </w:tc>
         <w:tc>
           <w:tcPr>
-            <w:tcW w:w="4366" w:type="dxa"/>
+            <w:tcW w:w="3910" w:type="dxa"/>
             <w:gridSpan w:val="2"/>
             <w:tcBorders>
               <w:top w:val="single" w:sz="4" w:space="0" w:color="auto"/>
@@ -4569,6 +4877,10 @@
             <w:noWrap/>
             <w:vAlign w:val="center"/>
             <w:hideMark/>
+            <w:tcMar>
+              <w:bottom w:w="40" w:type="dxa"/>
+              <w:top w:w="20" w:type="dxa"/>
+            </w:tcMar>
           </w:tcPr>
           <w:p>
             <w:pPr>
@@ -4598,6 +4910,10 @@
             <w:noWrap/>
             <w:vAlign w:val="center"/>
             <w:hideMark/>
+            <w:tcMar>
+              <w:bottom w:w="40" w:type="dxa"/>
+              <w:top w:w="20" w:type="dxa"/>
+            </w:tcMar>
           </w:tcPr>
           <w:p>
             <w:pPr>
@@ -4628,7 +4944,7 @@
         </w:tc>
         <w:tc>
           <w:tcPr>
-            <w:tcW w:w="754" w:type="dxa"/>
+            <w:tcW w:w="1500" w:type="dxa"/>
             <w:tcBorders>
               <w:top w:val="nil"/>
               <w:left w:val="nil"/>
@@ -4639,6 +4955,10 @@
             <w:noWrap/>
             <w:vAlign w:val="center"/>
             <w:hideMark/>
+            <w:tcMar>
+              <w:bottom w:w="40" w:type="dxa"/>
+              <w:top w:w="20" w:type="dxa"/>
+            </w:tcMar>
           </w:tcPr>
           <w:p>
             <w:pPr>
@@ -4663,7 +4983,7 @@
         </w:trPr>
         <w:tc>
           <w:tcPr>
-            <w:tcW w:w="3283" w:type="dxa"/>
+            <w:tcW w:w="2983" w:type="dxa"/>
             <w:gridSpan w:val="2"/>
             <w:tcBorders>
               <w:top w:val="single" w:sz="4" w:space="0" w:color="auto"/>
@@ -4675,6 +4995,10 @@
             <w:noWrap/>
             <w:vAlign w:val="center"/>
             <w:hideMark/>
+            <w:tcMar>
+              <w:bottom w:w="40" w:type="dxa"/>
+              <w:top w:w="20" w:type="dxa"/>
+            </w:tcMar>
           </w:tcPr>
           <w:p>
             <w:pPr>
@@ -4740,6 +5064,10 @@
             <w:noWrap/>
             <w:vAlign w:val="center"/>
             <w:hideMark/>
+            <w:tcMar>
+              <w:bottom w:w="40" w:type="dxa"/>
+              <w:top w:w="20" w:type="dxa"/>
+            </w:tcMar>
           </w:tcPr>
           <w:p>
             <w:pPr>
@@ -4770,7 +5098,7 @@
         </w:tc>
         <w:tc>
           <w:tcPr>
-            <w:tcW w:w="4366" w:type="dxa"/>
+            <w:tcW w:w="3910" w:type="dxa"/>
             <w:gridSpan w:val="2"/>
             <w:tcBorders>
               <w:top w:val="single" w:sz="4" w:space="0" w:color="auto"/>
@@ -4782,6 +5110,10 @@
             <w:noWrap/>
             <w:vAlign w:val="center"/>
             <w:hideMark/>
+            <w:tcMar>
+              <w:bottom w:w="40" w:type="dxa"/>
+              <w:top w:w="20" w:type="dxa"/>
+            </w:tcMar>
           </w:tcPr>
           <w:p>
             <w:pPr>
@@ -4823,6 +5155,10 @@
             <w:noWrap/>
             <w:vAlign w:val="center"/>
             <w:hideMark/>
+            <w:tcMar>
+              <w:bottom w:w="40" w:type="dxa"/>
+              <w:top w:w="20" w:type="dxa"/>
+            </w:tcMar>
           </w:tcPr>
           <w:p>
             <w:pPr>
@@ -4853,7 +5189,7 @@
         </w:tc>
         <w:tc>
           <w:tcPr>
-            <w:tcW w:w="754" w:type="dxa"/>
+            <w:tcW w:w="1500" w:type="dxa"/>
             <w:tcBorders>
               <w:top w:val="nil"/>
               <w:left w:val="nil"/>
@@ -4864,6 +5200,10 @@
             <w:noWrap/>
             <w:vAlign w:val="center"/>
             <w:hideMark/>
+            <w:tcMar>
+              <w:bottom w:w="40" w:type="dxa"/>
+              <w:top w:w="20" w:type="dxa"/>
+            </w:tcMar>
           </w:tcPr>
           <w:p>
             <w:pPr>
@@ -4911,6 +5251,10 @@
             <w:noWrap/>
             <w:vAlign w:val="center"/>
             <w:hideMark/>
+            <w:tcMar>
+              <w:bottom w:w="40" w:type="dxa"/>
+              <w:top w:w="20" w:type="dxa"/>
+            </w:tcMar>
           </w:tcPr>
           <w:p>
             <w:pPr>
@@ -4941,7 +5285,7 @@
         </w:tc>
         <w:tc>
           <w:tcPr>
-            <w:tcW w:w="800" w:type="dxa"/>
+            <w:tcW w:w="500" w:type="dxa"/>
             <w:tcBorders>
               <w:top w:val="nil"/>
               <w:left w:val="nil"/>
@@ -4952,6 +5296,10 @@
             <w:noWrap/>
             <w:vAlign w:val="center"/>
             <w:hideMark/>
+            <w:tcMar>
+              <w:bottom w:w="40" w:type="dxa"/>
+              <w:top w:w="20" w:type="dxa"/>
+            </w:tcMar>
           </w:tcPr>
           <w:p>
             <w:pPr>
@@ -4993,6 +5341,10 @@
             <w:noWrap/>
             <w:vAlign w:val="center"/>
             <w:hideMark/>
+            <w:tcMar>
+              <w:bottom w:w="40" w:type="dxa"/>
+              <w:top w:w="20" w:type="dxa"/>
+            </w:tcMar>
           </w:tcPr>
           <w:p>
             <w:pPr>
@@ -5049,7 +5401,7 @@
         </w:tc>
         <w:tc>
           <w:tcPr>
-            <w:tcW w:w="4366" w:type="dxa"/>
+            <w:tcW w:w="3910" w:type="dxa"/>
             <w:gridSpan w:val="2"/>
             <w:tcBorders>
               <w:top w:val="single" w:sz="4" w:space="0" w:color="auto"/>
@@ -5061,6 +5413,10 @@
             <w:noWrap/>
             <w:vAlign w:val="center"/>
             <w:hideMark/>
+            <w:tcMar>
+              <w:bottom w:w="40" w:type="dxa"/>
+              <w:top w:w="20" w:type="dxa"/>
+            </w:tcMar>
           </w:tcPr>
           <w:p>
             <w:pPr>
@@ -5106,6 +5462,10 @@
             <w:noWrap/>
             <w:vAlign w:val="center"/>
             <w:hideMark/>
+            <w:tcMar>
+              <w:bottom w:w="40" w:type="dxa"/>
+              <w:top w:w="20" w:type="dxa"/>
+            </w:tcMar>
           </w:tcPr>
           <w:p>
             <w:pPr>
@@ -5140,7 +5500,7 @@
         </w:tc>
         <w:tc>
           <w:tcPr>
-            <w:tcW w:w="754" w:type="dxa"/>
+            <w:tcW w:w="1500" w:type="dxa"/>
             <w:tcBorders>
               <w:top w:val="nil"/>
               <w:left w:val="nil"/>
@@ -5151,6 +5511,10 @@
             <w:noWrap/>
             <w:vAlign w:val="center"/>
             <w:hideMark/>
+            <w:tcMar>
+              <w:bottom w:w="40" w:type="dxa"/>
+              <w:top w:w="20" w:type="dxa"/>
+            </w:tcMar>
           </w:tcPr>
           <w:p>
             <w:pPr>
@@ -5202,6 +5566,10 @@
             <w:noWrap/>
             <w:vAlign w:val="center"/>
             <w:hideMark/>
+            <w:tcMar>
+              <w:bottom w:w="40" w:type="dxa"/>
+              <w:top w:w="20" w:type="dxa"/>
+            </w:tcMar>
           </w:tcPr>
           <w:p>
             <w:pPr>
@@ -5232,7 +5600,7 @@
         </w:tc>
         <w:tc>
           <w:tcPr>
-            <w:tcW w:w="800" w:type="dxa"/>
+            <w:tcW w:w="500" w:type="dxa"/>
             <w:tcBorders>
               <w:top w:val="nil"/>
               <w:left w:val="nil"/>
@@ -5243,6 +5611,10 @@
             <w:noWrap/>
             <w:vAlign w:val="center"/>
             <w:hideMark/>
+            <w:tcMar>
+              <w:bottom w:w="40" w:type="dxa"/>
+              <w:top w:w="20" w:type="dxa"/>
+            </w:tcMar>
           </w:tcPr>
           <w:p>
             <w:pPr>
@@ -5284,6 +5656,10 @@
             <w:noWrap/>
             <w:vAlign w:val="center"/>
             <w:hideMark/>
+            <w:tcMar>
+              <w:bottom w:w="40" w:type="dxa"/>
+              <w:top w:w="20" w:type="dxa"/>
+            </w:tcMar>
           </w:tcPr>
           <w:p>
             <w:pPr>
@@ -5314,7 +5690,7 @@
         </w:tc>
         <w:tc>
           <w:tcPr>
-            <w:tcW w:w="4366" w:type="dxa"/>
+            <w:tcW w:w="3910" w:type="dxa"/>
             <w:gridSpan w:val="2"/>
             <w:tcBorders>
               <w:top w:val="single" w:sz="4" w:space="0" w:color="auto"/>
@@ -5326,6 +5702,10 @@
             <w:noWrap/>
             <w:vAlign w:val="center"/>
             <w:hideMark/>
+            <w:tcMar>
+              <w:bottom w:w="40" w:type="dxa"/>
+              <w:top w:w="20" w:type="dxa"/>
+            </w:tcMar>
           </w:tcPr>
           <w:p>
             <w:pPr>
@@ -5367,6 +5747,10 @@
             <w:noWrap/>
             <w:vAlign w:val="center"/>
             <w:hideMark/>
+            <w:tcMar>
+              <w:bottom w:w="40" w:type="dxa"/>
+              <w:top w:w="20" w:type="dxa"/>
+            </w:tcMar>
           </w:tcPr>
           <w:p>
             <w:pPr>
@@ -5445,7 +5829,7 @@
         </w:tc>
         <w:tc>
           <w:tcPr>
-            <w:tcW w:w="754" w:type="dxa"/>
+            <w:tcW w:w="1500" w:type="dxa"/>
             <w:tcBorders>
               <w:top w:val="nil"/>
               <w:left w:val="nil"/>
@@ -5456,6 +5840,10 @@
             <w:noWrap/>
             <w:vAlign w:val="center"/>
             <w:hideMark/>
+            <w:tcMar>
+              <w:bottom w:w="40" w:type="dxa"/>
+              <w:top w:w="20" w:type="dxa"/>
+            </w:tcMar>
           </w:tcPr>
           <w:p>
             <w:pPr>
@@ -5503,6 +5891,10 @@
             <w:noWrap/>
             <w:vAlign w:val="center"/>
             <w:hideMark/>
+            <w:tcMar>
+              <w:bottom w:w="40" w:type="dxa"/>
+              <w:top w:w="20" w:type="dxa"/>
+            </w:tcMar>
           </w:tcPr>
           <w:p>
             <w:pPr>
@@ -5533,7 +5925,7 @@
         </w:tc>
         <w:tc>
           <w:tcPr>
-            <w:tcW w:w="800" w:type="dxa"/>
+            <w:tcW w:w="500" w:type="dxa"/>
             <w:tcBorders>
               <w:top w:val="nil"/>
               <w:left w:val="nil"/>
@@ -5544,6 +5936,10 @@
             <w:noWrap/>
             <w:vAlign w:val="center"/>
             <w:hideMark/>
+            <w:tcMar>
+              <w:bottom w:w="40" w:type="dxa"/>
+              <w:top w:w="20" w:type="dxa"/>
+            </w:tcMar>
           </w:tcPr>
           <w:p>
             <w:pPr>
@@ -5585,6 +5981,10 @@
             <w:noWrap/>
             <w:vAlign w:val="center"/>
             <w:hideMark/>
+            <w:tcMar>
+              <w:bottom w:w="40" w:type="dxa"/>
+              <w:top w:w="20" w:type="dxa"/>
+            </w:tcMar>
           </w:tcPr>
           <w:p>
             <w:pPr>
@@ -5615,7 +6015,7 @@
         </w:tc>
         <w:tc>
           <w:tcPr>
-            <w:tcW w:w="4366" w:type="dxa"/>
+            <w:tcW w:w="3910" w:type="dxa"/>
             <w:gridSpan w:val="2"/>
             <w:tcBorders>
               <w:top w:val="single" w:sz="4" w:space="0" w:color="auto"/>
@@ -5627,6 +6027,10 @@
             <w:noWrap/>
             <w:vAlign w:val="center"/>
             <w:hideMark/>
+            <w:tcMar>
+              <w:bottom w:w="40" w:type="dxa"/>
+              <w:top w:w="20" w:type="dxa"/>
+            </w:tcMar>
           </w:tcPr>
           <w:p>
             <w:pPr>
@@ -5668,6 +6072,10 @@
             <w:noWrap/>
             <w:vAlign w:val="center"/>
             <w:hideMark/>
+            <w:tcMar>
+              <w:bottom w:w="40" w:type="dxa"/>
+              <w:top w:w="20" w:type="dxa"/>
+            </w:tcMar>
           </w:tcPr>
           <w:p>
             <w:pPr>
@@ -5734,7 +6142,7 @@
         </w:tc>
         <w:tc>
           <w:tcPr>
-            <w:tcW w:w="754" w:type="dxa"/>
+            <w:tcW w:w="1500" w:type="dxa"/>
             <w:tcBorders>
               <w:top w:val="nil"/>
               <w:left w:val="nil"/>
@@ -5745,6 +6153,10 @@
             <w:noWrap/>
             <w:vAlign w:val="center"/>
             <w:hideMark/>
+            <w:tcMar>
+              <w:bottom w:w="40" w:type="dxa"/>
+              <w:top w:w="20" w:type="dxa"/>
+            </w:tcMar>
           </w:tcPr>
           <w:p>
             <w:pPr>
@@ -5792,6 +6204,10 @@
             <w:noWrap/>
             <w:vAlign w:val="center"/>
             <w:hideMark/>
+            <w:tcMar>
+              <w:bottom w:w="40" w:type="dxa"/>
+              <w:top w:w="20" w:type="dxa"/>
+            </w:tcMar>
           </w:tcPr>
           <w:p>
             <w:pPr>
@@ -5822,7 +6238,7 @@
         </w:tc>
         <w:tc>
           <w:tcPr>
-            <w:tcW w:w="800" w:type="dxa"/>
+            <w:tcW w:w="500" w:type="dxa"/>
             <w:tcBorders>
               <w:top w:val="nil"/>
               <w:left w:val="nil"/>
@@ -5833,6 +6249,10 @@
             <w:noWrap/>
             <w:vAlign w:val="center"/>
             <w:hideMark/>
+            <w:tcMar>
+              <w:bottom w:w="40" w:type="dxa"/>
+              <w:top w:w="20" w:type="dxa"/>
+            </w:tcMar>
           </w:tcPr>
           <w:p>
             <w:pPr>
@@ -5874,6 +6294,10 @@
             <w:noWrap/>
             <w:vAlign w:val="center"/>
             <w:hideMark/>
+            <w:tcMar>
+              <w:bottom w:w="40" w:type="dxa"/>
+              <w:top w:w="20" w:type="dxa"/>
+            </w:tcMar>
           </w:tcPr>
           <w:p>
             <w:pPr>
@@ -5904,7 +6328,7 @@
         </w:tc>
         <w:tc>
           <w:tcPr>
-            <w:tcW w:w="4366" w:type="dxa"/>
+            <w:tcW w:w="3910" w:type="dxa"/>
             <w:gridSpan w:val="2"/>
             <w:tcBorders>
               <w:top w:val="single" w:sz="4" w:space="0" w:color="auto"/>
@@ -5916,6 +6340,10 @@
             <w:noWrap/>
             <w:vAlign w:val="center"/>
             <w:hideMark/>
+            <w:tcMar>
+              <w:bottom w:w="40" w:type="dxa"/>
+              <w:top w:w="20" w:type="dxa"/>
+            </w:tcMar>
           </w:tcPr>
           <w:p>
             <w:pPr>
@@ -5957,6 +6385,10 @@
             <w:noWrap/>
             <w:vAlign w:val="center"/>
             <w:hideMark/>
+            <w:tcMar>
+              <w:bottom w:w="40" w:type="dxa"/>
+              <w:top w:w="20" w:type="dxa"/>
+            </w:tcMar>
           </w:tcPr>
           <w:p>
             <w:pPr>
@@ -5999,7 +6431,7 @@
         </w:tc>
         <w:tc>
           <w:tcPr>
-            <w:tcW w:w="754" w:type="dxa"/>
+            <w:tcW w:w="1500" w:type="dxa"/>
             <w:tcBorders>
               <w:top w:val="nil"/>
               <w:left w:val="nil"/>
@@ -6010,6 +6442,10 @@
             <w:noWrap/>
             <w:vAlign w:val="center"/>
             <w:hideMark/>
+            <w:tcMar>
+              <w:bottom w:w="40" w:type="dxa"/>
+              <w:top w:w="20" w:type="dxa"/>
+            </w:tcMar>
           </w:tcPr>
           <w:p>
             <w:pPr>
@@ -6046,7 +6482,7 @@
         </w:trPr>
         <w:tc>
           <w:tcPr>
-            <w:tcW w:w="3283" w:type="dxa"/>
+            <w:tcW w:w="2983" w:type="dxa"/>
             <w:gridSpan w:val="2"/>
             <w:tcBorders>
               <w:top w:val="single" w:sz="4" w:space="0" w:color="auto"/>
@@ -6058,6 +6494,10 @@
             <w:noWrap/>
             <w:vAlign w:val="center"/>
             <w:hideMark/>
+            <w:tcMar>
+              <w:bottom w:w="40" w:type="dxa"/>
+              <w:top w:w="20" w:type="dxa"/>
+            </w:tcMar>
           </w:tcPr>
           <w:p>
             <w:pPr>
@@ -6104,6 +6544,10 @@
             <w:noWrap/>
             <w:vAlign w:val="center"/>
             <w:hideMark/>
+            <w:tcMar>
+              <w:bottom w:w="40" w:type="dxa"/>
+              <w:top w:w="20" w:type="dxa"/>
+            </w:tcMar>
           </w:tcPr>
           <w:p>
             <w:pPr>
@@ -6149,6 +6593,10 @@
             <w:noWrap/>
             <w:vAlign w:val="center"/>
             <w:hideMark/>
+            <w:tcMar>
+              <w:bottom w:w="40" w:type="dxa"/>
+              <w:top w:w="20" w:type="dxa"/>
+            </w:tcMar>
           </w:tcPr>
           <w:p>
             <w:pPr>
@@ -6183,7 +6631,7 @@
         </w:tc>
         <w:tc>
           <w:tcPr>
-            <w:tcW w:w="1256" w:type="dxa"/>
+            <w:tcW w:w="800" w:type="dxa"/>
             <w:tcBorders>
               <w:top w:val="nil"/>
               <w:left w:val="single" w:sz="4" w:space="0" w:color="auto"/>
@@ -6194,6 +6642,10 @@
             <w:noWrap/>
             <w:vAlign w:val="center"/>
             <w:hideMark/>
+            <w:tcMar>
+              <w:bottom w:w="40" w:type="dxa"/>
+              <w:top w:w="20" w:type="dxa"/>
+            </w:tcMar>
           </w:tcPr>
           <w:p>
             <w:pPr>
@@ -6239,6 +6691,10 @@
             <w:noWrap/>
             <w:vAlign w:val="center"/>
             <w:hideMark/>
+            <w:tcMar>
+              <w:bottom w:w="40" w:type="dxa"/>
+              <w:top w:w="20" w:type="dxa"/>
+            </w:tcMar>
           </w:tcPr>
           <w:p>
             <w:pPr>
@@ -6301,7 +6757,7 @@
         </w:tc>
         <w:tc>
           <w:tcPr>
-            <w:tcW w:w="754" w:type="dxa"/>
+            <w:tcW w:w="1500" w:type="dxa"/>
             <w:tcBorders>
               <w:top w:val="nil"/>
               <w:left w:val="nil"/>
@@ -6312,6 +6768,10 @@
             <w:noWrap/>
             <w:vAlign w:val="center"/>
             <w:hideMark/>
+            <w:tcMar>
+              <w:bottom w:w="40" w:type="dxa"/>
+              <w:top w:w="20" w:type="dxa"/>
+            </w:tcMar>
           </w:tcPr>
           <w:p>
             <w:pPr>
@@ -6352,7 +6812,7 @@
         </w:trPr>
         <w:tc>
           <w:tcPr>
-            <w:tcW w:w="11819" w:type="dxa"/>
+            <w:tcW w:w="11809" w:type="dxa"/>
             <w:gridSpan w:val="7"/>
             <w:tcBorders>
               <w:top w:val="single" w:sz="4" w:space="0" w:color="auto"/>
@@ -6364,6 +6824,10 @@
             <w:noWrap/>
             <w:vAlign w:val="center"/>
             <w:hideMark/>
+            <w:tcMar>
+              <w:bottom w:w="40" w:type="dxa"/>
+              <w:top w:w="20" w:type="dxa"/>
+            </w:tcMar>
           </w:tcPr>
           <w:p>
             <w:pPr>
@@ -6422,25 +6886,29 @@
             <w:noWrap/>
             <w:vAlign w:val="center"/>
             <w:hideMark/>
-          </w:tcPr>
-          <w:p>
-            <w:pPr>
-              <w:spacing w:after="0" w:line="240" w:lineRule="auto"/>
-              <w:rPr>
-                <w:rFonts w:ascii="Arial" w:eastAsia="Times New Roman" w:hAnsi="Arial" w:cs="Arial"/>
-                <w:color w:val="000000"/>
-                <w:kern w:val="0"/>
-                <w:sz w:val="22"/>
-                <w:szCs w:val="22"/>
-                <w:lang w:eastAsia="vi-VN"/>
-                <w14:ligatures w14:val="none"/>
-              </w:rPr>
-            </w:pPr>
-          </w:p>
-        </w:tc>
-        <w:tc>
-          <w:tcPr>
-            <w:tcW w:w="800" w:type="dxa"/>
+            <w:tcMar>
+              <w:bottom w:w="40" w:type="dxa"/>
+              <w:top w:w="20" w:type="dxa"/>
+            </w:tcMar>
+          </w:tcPr>
+          <w:p>
+            <w:pPr>
+              <w:spacing w:after="0" w:line="240" w:lineRule="auto"/>
+              <w:rPr>
+                <w:rFonts w:ascii="Arial" w:eastAsia="Times New Roman" w:hAnsi="Arial" w:cs="Arial"/>
+                <w:color w:val="000000"/>
+                <w:kern w:val="0"/>
+                <w:sz w:val="22"/>
+                <w:szCs w:val="22"/>
+                <w:lang w:eastAsia="vi-VN"/>
+                <w14:ligatures w14:val="none"/>
+              </w:rPr>
+            </w:pPr>
+          </w:p>
+        </w:tc>
+        <w:tc>
+          <w:tcPr>
+            <w:tcW w:w="500" w:type="dxa"/>
             <w:tcBorders>
               <w:top w:val="nil"/>
               <w:left w:val="nil"/>
@@ -6451,6 +6919,10 @@
             <w:noWrap/>
             <w:vAlign w:val="center"/>
             <w:hideMark/>
+            <w:tcMar>
+              <w:bottom w:w="40" w:type="dxa"/>
+              <w:top w:w="20" w:type="dxa"/>
+            </w:tcMar>
           </w:tcPr>
           <w:p>
             <w:pPr>
@@ -6479,6 +6951,10 @@
             <w:noWrap/>
             <w:vAlign w:val="center"/>
             <w:hideMark/>
+            <w:tcMar>
+              <w:bottom w:w="40" w:type="dxa"/>
+              <w:top w:w="20" w:type="dxa"/>
+            </w:tcMar>
           </w:tcPr>
           <w:p>
             <w:pPr>
@@ -6507,6 +6983,10 @@
             <w:noWrap/>
             <w:vAlign w:val="center"/>
             <w:hideMark/>
+            <w:tcMar>
+              <w:bottom w:w="40" w:type="dxa"/>
+              <w:top w:w="20" w:type="dxa"/>
+            </w:tcMar>
           </w:tcPr>
           <w:p>
             <w:pPr>
@@ -6524,7 +7004,7 @@
         </w:tc>
         <w:tc>
           <w:tcPr>
-            <w:tcW w:w="1256" w:type="dxa"/>
+            <w:tcW w:w="800" w:type="dxa"/>
             <w:tcBorders>
               <w:top w:val="nil"/>
               <w:left w:val="nil"/>
@@ -6535,6 +7015,10 @@
             <w:noWrap/>
             <w:vAlign w:val="center"/>
             <w:hideMark/>
+            <w:tcMar>
+              <w:bottom w:w="40" w:type="dxa"/>
+              <w:top w:w="20" w:type="dxa"/>
+            </w:tcMar>
           </w:tcPr>
           <w:p>
             <w:pPr>
@@ -6563,6 +7047,10 @@
             <w:noWrap/>
             <w:vAlign w:val="center"/>
             <w:hideMark/>
+            <w:tcMar>
+              <w:bottom w:w="40" w:type="dxa"/>
+              <w:top w:w="20" w:type="dxa"/>
+            </w:tcMar>
           </w:tcPr>
           <w:p>
             <w:pPr>
@@ -6580,7 +7068,7 @@
         </w:tc>
         <w:tc>
           <w:tcPr>
-            <w:tcW w:w="754" w:type="dxa"/>
+            <w:tcW w:w="1500" w:type="dxa"/>
             <w:tcBorders>
               <w:top w:val="nil"/>
               <w:left w:val="nil"/>
@@ -6591,6 +7079,10 @@
             <w:noWrap/>
             <w:vAlign w:val="center"/>
             <w:hideMark/>
+            <w:tcMar>
+              <w:bottom w:w="40" w:type="dxa"/>
+              <w:top w:w="20" w:type="dxa"/>
+            </w:tcMar>
           </w:tcPr>
           <w:p>
             <w:pPr>
@@ -6624,6 +7116,10 @@
             <w:noWrap/>
             <w:vAlign w:val="center"/>
             <w:hideMark/>
+            <w:tcMar>
+              <w:bottom w:w="40" w:type="dxa"/>
+              <w:top w:w="20" w:type="dxa"/>
+            </w:tcMar>
           </w:tcPr>
           <w:p>
             <w:pPr>
@@ -6658,7 +7154,7 @@
         </w:tc>
         <w:tc>
           <w:tcPr>
-            <w:tcW w:w="2496" w:type="dxa"/>
+            <w:tcW w:w="2196" w:type="dxa"/>
             <w:gridSpan w:val="2"/>
             <w:tcBorders>
               <w:top w:val="single" w:sz="4" w:space="0" w:color="auto"/>
@@ -6670,6 +7166,10 @@
             <w:noWrap/>
             <w:vAlign w:val="center"/>
             <w:hideMark/>
+            <w:tcMar>
+              <w:bottom w:w="40" w:type="dxa"/>
+              <w:top w:w="20" w:type="dxa"/>
+            </w:tcMar>
           </w:tcPr>
           <w:p>
             <w:pPr>
@@ -6716,6 +7216,10 @@
             <w:noWrap/>
             <w:vAlign w:val="center"/>
             <w:hideMark/>
+            <w:tcMar>
+              <w:bottom w:w="40" w:type="dxa"/>
+              <w:top w:w="20" w:type="dxa"/>
+            </w:tcMar>
           </w:tcPr>
           <w:p>
             <w:pPr>
@@ -6751,7 +7255,7 @@
         </w:tc>
         <w:tc>
           <w:tcPr>
-            <w:tcW w:w="1256" w:type="dxa"/>
+            <w:tcW w:w="800" w:type="dxa"/>
             <w:tcBorders>
               <w:top w:val="single" w:sz="4" w:space="0" w:color="auto"/>
               <w:left w:val="nil"/>
@@ -6762,6 +7266,10 @@
             <w:noWrap/>
             <w:vAlign w:val="center"/>
             <w:hideMark/>
+            <w:tcMar>
+              <w:bottom w:w="40" w:type="dxa"/>
+              <w:top w:w="20" w:type="dxa"/>
+            </w:tcMar>
           </w:tcPr>
           <w:p>
             <w:pPr>
@@ -6797,7 +7305,7 @@
         </w:tc>
         <w:tc>
           <w:tcPr>
-            <w:tcW w:w="2474" w:type="dxa"/>
+            <w:tcW w:w="3220" w:type="dxa"/>
             <w:gridSpan w:val="2"/>
             <w:tcBorders>
               <w:top w:val="single" w:sz="4" w:space="0" w:color="auto"/>
@@ -6809,6 +7317,10 @@
             <w:noWrap/>
             <w:vAlign w:val="center"/>
             <w:hideMark/>
+            <w:tcMar>
+              <w:bottom w:w="40" w:type="dxa"/>
+              <w:top w:w="20" w:type="dxa"/>
+            </w:tcMar>
           </w:tcPr>
           <w:p>
             <w:pPr>
@@ -6860,6 +7372,10 @@
             <w:noWrap/>
             <w:vAlign w:val="center"/>
             <w:hideMark/>
+            <w:tcMar>
+              <w:bottom w:w="40" w:type="dxa"/>
+              <w:top w:w="20" w:type="dxa"/>
+            </w:tcMar>
           </w:tcPr>
           <w:p>
             <w:pPr>
@@ -6890,7 +7406,7 @@
         </w:tc>
         <w:tc>
           <w:tcPr>
-            <w:tcW w:w="2496" w:type="dxa"/>
+            <w:tcW w:w="2196" w:type="dxa"/>
             <w:gridSpan w:val="2"/>
             <w:tcBorders>
               <w:top w:val="single" w:sz="4" w:space="0" w:color="auto"/>
@@ -6902,6 +7418,10 @@
             <w:noWrap/>
             <w:vAlign w:val="center"/>
             <w:hideMark/>
+            <w:tcMar>
+              <w:bottom w:w="40" w:type="dxa"/>
+              <w:top w:w="20" w:type="dxa"/>
+            </w:tcMar>
           </w:tcPr>
           <w:p>
             <w:pPr>
@@ -6968,6 +7488,10 @@
             <w:noWrap/>
             <w:vAlign w:val="center"/>
             <w:hideMark/>
+            <w:tcMar>
+              <w:bottom w:w="40" w:type="dxa"/>
+              <w:top w:w="20" w:type="dxa"/>
+            </w:tcMar>
           </w:tcPr>
           <w:p>
             <w:pPr>
@@ -7034,7 +7558,7 @@
         </w:tc>
         <w:tc>
           <w:tcPr>
-            <w:tcW w:w="1256" w:type="dxa"/>
+            <w:tcW w:w="800" w:type="dxa"/>
             <w:tcBorders>
               <w:top w:val="nil"/>
               <w:left w:val="nil"/>
@@ -7045,6 +7569,10 @@
             <w:noWrap/>
             <w:vAlign w:val="center"/>
             <w:hideMark/>
+            <w:tcMar>
+              <w:bottom w:w="40" w:type="dxa"/>
+              <w:top w:w="20" w:type="dxa"/>
+            </w:tcMar>
           </w:tcPr>
           <w:p>
             <w:pPr>
@@ -7111,7 +7639,7 @@
         </w:tc>
         <w:tc>
           <w:tcPr>
-            <w:tcW w:w="2474" w:type="dxa"/>
+            <w:tcW w:w="3220" w:type="dxa"/>
             <w:gridSpan w:val="2"/>
             <w:tcBorders>
               <w:top w:val="single" w:sz="4" w:space="0" w:color="auto"/>
@@ -7123,6 +7651,10 @@
             <w:noWrap/>
             <w:vAlign w:val="center"/>
             <w:hideMark/>
+            <w:tcMar>
+              <w:bottom w:w="40" w:type="dxa"/>
+              <w:top w:w="20" w:type="dxa"/>
+            </w:tcMar>
           </w:tcPr>
           <w:p>
             <w:pPr>
@@ -7193,6 +7725,10 @@
             <w:shd w:val="clear" w:color="auto" w:fill="auto"/>
             <w:vAlign w:val="center"/>
             <w:hideMark/>
+            <w:tcMar>
+              <w:bottom w:w="40" w:type="dxa"/>
+              <w:top w:w="20" w:type="dxa"/>
+            </w:tcMar>
           </w:tcPr>
           <w:p>
             <w:pPr>
@@ -7235,7 +7771,7 @@
         </w:tc>
         <w:tc>
           <w:tcPr>
-            <w:tcW w:w="2496" w:type="dxa"/>
+            <w:tcW w:w="2196" w:type="dxa"/>
             <w:gridSpan w:val="2"/>
             <w:tcBorders>
               <w:top w:val="single" w:sz="4" w:space="0" w:color="auto"/>
@@ -7247,6 +7783,10 @@
             <w:noWrap/>
             <w:vAlign w:val="center"/>
             <w:hideMark/>
+            <w:tcMar>
+              <w:bottom w:w="40" w:type="dxa"/>
+              <w:top w:w="20" w:type="dxa"/>
+            </w:tcMar>
           </w:tcPr>
           <w:p>
             <w:pPr>
@@ -7313,6 +7853,10 @@
             <w:noWrap/>
             <w:vAlign w:val="center"/>
             <w:hideMark/>
+            <w:tcMar>
+              <w:bottom w:w="40" w:type="dxa"/>
+              <w:top w:w="20" w:type="dxa"/>
+            </w:tcMar>
           </w:tcPr>
           <w:p>
             <w:pPr>
@@ -7379,7 +7923,7 @@
         </w:tc>
         <w:tc>
           <w:tcPr>
-            <w:tcW w:w="1256" w:type="dxa"/>
+            <w:tcW w:w="800" w:type="dxa"/>
             <w:tcBorders>
               <w:top w:val="nil"/>
               <w:left w:val="nil"/>
@@ -7390,6 +7934,10 @@
             <w:noWrap/>
             <w:vAlign w:val="center"/>
             <w:hideMark/>
+            <w:tcMar>
+              <w:bottom w:w="40" w:type="dxa"/>
+              <w:top w:w="20" w:type="dxa"/>
+            </w:tcMar>
           </w:tcPr>
           <w:p>
             <w:pPr>
@@ -7456,7 +8004,7 @@
         </w:tc>
         <w:tc>
           <w:tcPr>
-            <w:tcW w:w="2474" w:type="dxa"/>
+            <w:tcW w:w="3220" w:type="dxa"/>
             <w:gridSpan w:val="2"/>
             <w:tcBorders>
               <w:top w:val="single" w:sz="4" w:space="0" w:color="auto"/>
@@ -7468,6 +8016,10 @@
             <w:noWrap/>
             <w:vAlign w:val="center"/>
             <w:hideMark/>
+            <w:tcMar>
+              <w:bottom w:w="40" w:type="dxa"/>
+              <w:top w:w="20" w:type="dxa"/>
+            </w:tcMar>
           </w:tcPr>
           <w:p>
             <w:pPr>
@@ -7539,6 +8091,10 @@
             <w:noWrap/>
             <w:vAlign w:val="center"/>
             <w:hideMark/>
+            <w:tcMar>
+              <w:bottom w:w="40" w:type="dxa"/>
+              <w:top w:w="20" w:type="dxa"/>
+            </w:tcMar>
           </w:tcPr>
           <w:p>
             <w:pPr>
@@ -7558,7 +8114,7 @@
         </w:tc>
         <w:tc>
           <w:tcPr>
-            <w:tcW w:w="800" w:type="dxa"/>
+            <w:tcW w:w="500" w:type="dxa"/>
             <w:tcBorders>
               <w:top w:val="nil"/>
               <w:left w:val="nil"/>
@@ -7569,6 +8125,10 @@
             <w:noWrap/>
             <w:vAlign w:val="center"/>
             <w:hideMark/>
+            <w:tcMar>
+              <w:bottom w:w="40" w:type="dxa"/>
+              <w:top w:w="20" w:type="dxa"/>
+            </w:tcMar>
           </w:tcPr>
           <w:p>
             <w:pPr>
@@ -7597,6 +8157,10 @@
             <w:noWrap/>
             <w:vAlign w:val="center"/>
             <w:hideMark/>
+            <w:tcMar>
+              <w:bottom w:w="40" w:type="dxa"/>
+              <w:top w:w="20" w:type="dxa"/>
+            </w:tcMar>
           </w:tcPr>
           <w:p>
             <w:pPr>
@@ -7625,6 +8189,10 @@
             <w:noWrap/>
             <w:vAlign w:val="center"/>
             <w:hideMark/>
+            <w:tcMar>
+              <w:bottom w:w="40" w:type="dxa"/>
+              <w:top w:w="20" w:type="dxa"/>
+            </w:tcMar>
           </w:tcPr>
           <w:p>
             <w:pPr>
@@ -7642,7 +8210,7 @@
         </w:tc>
         <w:tc>
           <w:tcPr>
-            <w:tcW w:w="1256" w:type="dxa"/>
+            <w:tcW w:w="800" w:type="dxa"/>
             <w:tcBorders>
               <w:top w:val="nil"/>
               <w:left w:val="nil"/>
@@ -7653,6 +8221,10 @@
             <w:noWrap/>
             <w:vAlign w:val="center"/>
             <w:hideMark/>
+            <w:tcMar>
+              <w:bottom w:w="40" w:type="dxa"/>
+              <w:top w:w="20" w:type="dxa"/>
+            </w:tcMar>
           </w:tcPr>
           <w:p>
             <w:pPr>
@@ -7681,6 +8253,10 @@
             <w:noWrap/>
             <w:vAlign w:val="center"/>
             <w:hideMark/>
+            <w:tcMar>
+              <w:bottom w:w="40" w:type="dxa"/>
+              <w:top w:w="20" w:type="dxa"/>
+            </w:tcMar>
           </w:tcPr>
           <w:p>
             <w:pPr>
@@ -7698,7 +8274,7 @@
         </w:tc>
         <w:tc>
           <w:tcPr>
-            <w:tcW w:w="754" w:type="dxa"/>
+            <w:tcW w:w="1500" w:type="dxa"/>
             <w:tcBorders>
               <w:top w:val="nil"/>
               <w:left w:val="nil"/>
@@ -7709,6 +8285,10 @@
             <w:noWrap/>
             <w:vAlign w:val="center"/>
             <w:hideMark/>
+            <w:tcMar>
+              <w:bottom w:w="40" w:type="dxa"/>
+              <w:top w:w="20" w:type="dxa"/>
+            </w:tcMar>
           </w:tcPr>
           <w:p>
             <w:pPr>
@@ -7731,7 +8311,7 @@
         </w:trPr>
         <w:tc>
           <w:tcPr>
-            <w:tcW w:w="11065" w:type="dxa"/>
+            <w:tcW w:w="10309" w:type="dxa"/>
             <w:gridSpan w:val="6"/>
             <w:tcBorders>
               <w:top w:val="nil"/>
@@ -7743,6 +8323,10 @@
             <w:noWrap/>
             <w:vAlign w:val="bottom"/>
             <w:hideMark/>
+            <w:tcMar>
+              <w:bottom w:w="40" w:type="dxa"/>
+              <w:top w:w="20" w:type="dxa"/>
+            </w:tcMar>
           </w:tcPr>
           <w:p>
             <w:pPr>
@@ -7799,7 +8383,7 @@
         </w:tc>
         <w:tc>
           <w:tcPr>
-            <w:tcW w:w="754" w:type="dxa"/>
+            <w:tcW w:w="1500" w:type="dxa"/>
             <w:tcBorders>
               <w:top w:val="nil"/>
               <w:left w:val="nil"/>
@@ -7810,6 +8394,10 @@
             <w:noWrap/>
             <w:vAlign w:val="bottom"/>
             <w:hideMark/>
+            <w:tcMar>
+              <w:bottom w:w="40" w:type="dxa"/>
+              <w:top w:w="20" w:type="dxa"/>
+            </w:tcMar>
           </w:tcPr>
           <w:p>
             <w:pPr>

</xml_diff>